<commit_message>
Update JCPV layout: ABNT margins, Word header/footer, logo image
- Rewrite with proper Word native header/footer (not body tables)
- ABNT margins: left 3cm, right 2cm, top 3cm, bottom 2cm
- Times New Roman 12pt, 1.5 line spacing
- Add logo PNG generated from JCPV brand assets
- Standard petition structure with signature block
- Auto page numbering in footer

https://claude.ai/code/session_01WW4vHjg3E9N17hFivzC83z
</commit_message>
<xml_diff>
--- a/JCPV_Advocacia_Folha_Layout.docx
+++ b/JCPV_Advocacia_Folha_Layout.docx
@@ -2,667 +2,760 @@
 <file path=word/document.xml><?xml version="1.0" encoding="utf-8"?>
 <w:document xmlns:wpc="http://schemas.microsoft.com/office/word/2010/wordprocessingCanvas" xmlns:mo="http://schemas.microsoft.com/office/mac/office/2008/main" xmlns:mc="http://schemas.openxmlformats.org/markup-compatibility/2006" xmlns:mv="urn:schemas-microsoft-com:mac:vml" xmlns:o="urn:schemas-microsoft-com:office:office" xmlns:r="http://schemas.openxmlformats.org/officeDocument/2006/relationships" xmlns:m="http://schemas.openxmlformats.org/officeDocument/2006/math" xmlns:v="urn:schemas-microsoft-com:vml" xmlns:wp14="http://schemas.microsoft.com/office/word/2010/wordprocessingDrawing" xmlns:wp="http://schemas.openxmlformats.org/drawingml/2006/wordprocessingDrawing" xmlns:w10="urn:schemas-microsoft-com:office:word" xmlns:w="http://schemas.openxmlformats.org/wordprocessingml/2006/main" xmlns:w14="http://schemas.microsoft.com/office/word/2010/wordml" xmlns:wpg="http://schemas.microsoft.com/office/word/2010/wordprocessingGroup" xmlns:wpi="http://schemas.microsoft.com/office/word/2010/wordprocessingInk" xmlns:wne="http://schemas.microsoft.com/office/word/2006/wordml" xmlns:wps="http://schemas.microsoft.com/office/word/2010/wordprocessingShape" mc:Ignorable="w14 wp14">
   <w:body>
-    <w:tbl>
-      <w:tblPr>
-        <w:tblW w:type="auto" w:w="0"/>
-        <w:tblLook w:firstColumn="1" w:firstRow="1" w:lastColumn="0" w:lastRow="0" w:noHBand="0" w:noVBand="1" w:val="04A0"/>
-        <w:tblBorders>
-          <w:top w:val="none" w:sz="0" w:space="0" w:color="auto"/>
-          <w:left w:val="none" w:sz="0" w:space="0" w:color="auto"/>
-          <w:bottom w:val="none" w:sz="0" w:space="0" w:color="auto"/>
-          <w:right w:val="none" w:sz="0" w:space="0" w:color="auto"/>
-          <w:insideH w:val="none" w:sz="0" w:space="0" w:color="auto"/>
-          <w:insideV w:val="none" w:sz="0" w:space="0" w:color="auto"/>
-        </w:tblBorders>
-        <w:tblW w:w="11906" w:type="dxa"/>
-      </w:tblPr>
-      <w:tblGrid>
-        <w:gridCol w:w="9026"/>
-      </w:tblGrid>
-      <w:tr>
-        <w:trPr>
-          <w:trHeight w:val="2100" w:hRule="atLeast"/>
-        </w:trPr>
-        <w:tc>
-          <w:tcPr>
-            <w:tcW w:type="dxa" w:w="9026"/>
-            <w:shd w:val="clear" w:color="auto" w:fill="1E1E1E"/>
-            <w:tcMar>
-              <w:top w:w="520" w:type="dxa"/>
-              <w:left w:w="720" w:type="dxa"/>
-              <w:bottom w:w="420" w:type="dxa"/>
-              <w:right w:w="720" w:type="dxa"/>
-            </w:tcMar>
-          </w:tcPr>
-          <w:p>
-            <w:pPr>
-              <w:spacing w:before="0" w:after="0"/>
-              <w:jc w:val="center"/>
-            </w:pPr>
-            <w:r>
-              <w:rPr>
-                <w:rFonts w:ascii="Segoe UI" w:hAnsi="Segoe UI"/>
-                <w:color w:val="B89B6A"/>
-                <w:sz w:val="60"/>
-              </w:rPr>
-              <w:t>⚖</w:t>
-            </w:r>
-          </w:p>
-          <w:p>
-            <w:pPr>
-              <w:spacing w:before="80" w:after="0"/>
-              <w:jc w:val="center"/>
-            </w:pPr>
-            <w:r>
-              <w:rPr>
-                <w:rFonts w:ascii="Garamond" w:hAnsi="Garamond"/>
-                <w:b/>
-                <w:color w:val="B89B6A"/>
-                <w:sz w:val="56"/>
-              </w:rPr>
-              <w:t>J C P V</w:t>
-            </w:r>
-          </w:p>
-          <w:p>
-            <w:pPr>
-              <w:spacing w:before="40" w:after="0"/>
-              <w:jc w:val="center"/>
-            </w:pPr>
-            <w:r>
-              <w:rPr>
-                <w:rFonts w:ascii="Garamond" w:hAnsi="Garamond"/>
-                <w:b w:val="0"/>
-                <w:color w:val="B89B6A"/>
-                <w:sz w:val="18"/>
-              </w:rPr>
-              <w:t>A  D  V  O  C  A  C  I  A</w:t>
-            </w:r>
-          </w:p>
-          <w:p>
-            <w:pPr>
-              <w:spacing w:before="160" w:after="0"/>
-              <w:jc w:val="center"/>
-            </w:pPr>
-            <w:r>
-              <w:rPr>
-                <w:rFonts w:ascii="Garamond" w:hAnsi="Garamond"/>
-                <w:i/>
-                <w:color w:val="C8B899"/>
-                <w:sz w:val="18"/>
-              </w:rPr>
-              <w:t>A defesa técnica do seu patrimônio.</w:t>
-            </w:r>
-          </w:p>
-        </w:tc>
-      </w:tr>
-    </w:tbl>
-    <w:tbl>
-      <w:tblPr>
-        <w:tblW w:type="auto" w:w="0"/>
-        <w:tblLook w:firstColumn="1" w:firstRow="1" w:lastColumn="0" w:lastRow="0" w:noHBand="0" w:noVBand="1" w:val="04A0"/>
-        <w:tblBorders>
-          <w:top w:val="none" w:sz="0" w:space="0" w:color="auto"/>
-          <w:left w:val="none" w:sz="0" w:space="0" w:color="auto"/>
-          <w:bottom w:val="none" w:sz="0" w:space="0" w:color="auto"/>
-          <w:right w:val="none" w:sz="0" w:space="0" w:color="auto"/>
-          <w:insideH w:val="none" w:sz="0" w:space="0" w:color="auto"/>
-          <w:insideV w:val="none" w:sz="0" w:space="0" w:color="auto"/>
-        </w:tblBorders>
-        <w:tblW w:w="11906" w:type="dxa"/>
-      </w:tblPr>
-      <w:tblGrid>
-        <w:gridCol w:w="9026"/>
-      </w:tblGrid>
-      <w:tr>
-        <w:trPr>
-          <w:trHeight w:val="90" w:hRule="exact"/>
-        </w:trPr>
-        <w:tc>
-          <w:tcPr>
-            <w:tcW w:type="dxa" w:w="9026"/>
-            <w:shd w:val="clear" w:color="auto" w:fill="B89B6A"/>
-          </w:tcPr>
-          <w:p>
-            <w:r/>
-          </w:p>
-        </w:tc>
-      </w:tr>
-    </w:tbl>
-    <w:tbl>
-      <w:tblPr>
-        <w:tblW w:type="auto" w:w="0"/>
-        <w:tblLook w:firstColumn="1" w:firstRow="1" w:lastColumn="0" w:lastRow="0" w:noHBand="0" w:noVBand="1" w:val="04A0"/>
-        <w:tblBorders>
-          <w:top w:val="none" w:sz="0" w:space="0" w:color="auto"/>
-          <w:left w:val="none" w:sz="0" w:space="0" w:color="auto"/>
-          <w:bottom w:val="none" w:sz="0" w:space="0" w:color="auto"/>
-          <w:right w:val="none" w:sz="0" w:space="0" w:color="auto"/>
-          <w:insideH w:val="none" w:sz="0" w:space="0" w:color="auto"/>
-          <w:insideV w:val="none" w:sz="0" w:space="0" w:color="auto"/>
-        </w:tblBorders>
-        <w:tblW w:w="11906" w:type="dxa"/>
-      </w:tblPr>
-      <w:tblGrid>
-        <w:gridCol w:w="3009"/>
-        <w:gridCol w:w="3009"/>
-        <w:gridCol w:w="3009"/>
-      </w:tblGrid>
-      <w:tr>
-        <w:tc>
-          <w:tcPr>
-            <w:tcW w:type="dxa" w:w="3009"/>
-            <w:shd w:val="clear" w:color="auto" w:fill="2C2C2C"/>
-            <w:tcMar>
-              <w:top w:w="180" w:type="dxa"/>
-              <w:left w:w="500" w:type="dxa"/>
-              <w:bottom w:w="180" w:type="dxa"/>
-              <w:right w:w="500" w:type="dxa"/>
-            </w:tcMar>
-          </w:tcPr>
-          <w:p>
-            <w:pPr>
-              <w:spacing w:before="0" w:after="0"/>
-              <w:jc w:val="left"/>
-            </w:pPr>
-            <w:r>
-              <w:rPr>
-                <w:rFonts w:ascii="Garamond" w:hAnsi="Garamond"/>
-                <w:color w:val="B89B6A"/>
-                <w:sz w:val="16"/>
-              </w:rPr>
-              <w:t>⚖  OAB/PR 118.596</w:t>
-            </w:r>
-          </w:p>
-        </w:tc>
-        <w:tc>
-          <w:tcPr>
-            <w:tcW w:type="dxa" w:w="3009"/>
-            <w:shd w:val="clear" w:color="auto" w:fill="2C2C2C"/>
-            <w:tcMar>
-              <w:top w:w="180" w:type="dxa"/>
-              <w:left w:w="500" w:type="dxa"/>
-              <w:bottom w:w="180" w:type="dxa"/>
-              <w:right w:w="500" w:type="dxa"/>
-            </w:tcMar>
-          </w:tcPr>
-          <w:p>
-            <w:pPr>
-              <w:spacing w:before="0" w:after="0"/>
-              <w:jc w:val="center"/>
-            </w:pPr>
-            <w:r>
-              <w:rPr>
-                <w:rFonts w:ascii="Garamond" w:hAnsi="Garamond"/>
-                <w:color w:val="B89B6A"/>
-                <w:sz w:val="16"/>
-              </w:rPr>
-              <w:t>🔒  Sigilo Absoluto</w:t>
-            </w:r>
-          </w:p>
-        </w:tc>
-        <w:tc>
-          <w:tcPr>
-            <w:tcW w:type="dxa" w:w="3009"/>
-            <w:shd w:val="clear" w:color="auto" w:fill="2C2C2C"/>
-            <w:tcMar>
-              <w:top w:w="180" w:type="dxa"/>
-              <w:left w:w="500" w:type="dxa"/>
-              <w:bottom w:w="180" w:type="dxa"/>
-              <w:right w:w="500" w:type="dxa"/>
-            </w:tcMar>
-          </w:tcPr>
-          <w:p>
-            <w:pPr>
-              <w:spacing w:before="0" w:after="0"/>
-              <w:jc w:val="right"/>
-            </w:pPr>
-            <w:r>
-              <w:rPr>
-                <w:rFonts w:ascii="Garamond" w:hAnsi="Garamond"/>
-                <w:color w:val="B89B6A"/>
-                <w:sz w:val="16"/>
-              </w:rPr>
-              <w:t>🌐  Atuação Nacional</w:t>
-            </w:r>
-          </w:p>
-        </w:tc>
-      </w:tr>
-    </w:tbl>
-    <w:tbl>
-      <w:tblPr>
-        <w:tblW w:type="auto" w:w="0"/>
-        <w:tblLook w:firstColumn="1" w:firstRow="1" w:lastColumn="0" w:lastRow="0" w:noHBand="0" w:noVBand="1" w:val="04A0"/>
-        <w:tblBorders>
-          <w:top w:val="none" w:sz="0" w:space="0" w:color="auto"/>
-          <w:left w:val="none" w:sz="0" w:space="0" w:color="auto"/>
-          <w:bottom w:val="none" w:sz="0" w:space="0" w:color="auto"/>
-          <w:right w:val="none" w:sz="0" w:space="0" w:color="auto"/>
-          <w:insideH w:val="none" w:sz="0" w:space="0" w:color="auto"/>
-          <w:insideV w:val="none" w:sz="0" w:space="0" w:color="auto"/>
-        </w:tblBorders>
-        <w:tblW w:w="11906" w:type="dxa"/>
-      </w:tblPr>
-      <w:tblGrid>
-        <w:gridCol w:w="9026"/>
-      </w:tblGrid>
-      <w:tr>
-        <w:trPr>
-          <w:trHeight w:val="40" w:hRule="exact"/>
-        </w:trPr>
-        <w:tc>
-          <w:tcPr>
-            <w:tcW w:type="dxa" w:w="9026"/>
-            <w:shd w:val="clear" w:color="auto" w:fill="B89B6A"/>
-          </w:tcPr>
-          <w:p>
-            <w:r/>
-          </w:p>
-        </w:tc>
-      </w:tr>
-    </w:tbl>
-    <w:tbl>
-      <w:tblPr>
-        <w:tblW w:type="auto" w:w="0"/>
-        <w:tblLook w:firstColumn="1" w:firstRow="1" w:lastColumn="0" w:lastRow="0" w:noHBand="0" w:noVBand="1" w:val="04A0"/>
-        <w:tblBorders>
-          <w:top w:val="none" w:sz="0" w:space="0" w:color="auto"/>
-          <w:left w:val="none" w:sz="0" w:space="0" w:color="auto"/>
-          <w:bottom w:val="none" w:sz="0" w:space="0" w:color="auto"/>
-          <w:right w:val="none" w:sz="0" w:space="0" w:color="auto"/>
-          <w:insideH w:val="none" w:sz="0" w:space="0" w:color="auto"/>
-          <w:insideV w:val="none" w:sz="0" w:space="0" w:color="auto"/>
-        </w:tblBorders>
-        <w:tblW w:w="11906" w:type="dxa"/>
-      </w:tblPr>
-      <w:tblGrid>
-        <w:gridCol w:w="9026"/>
-      </w:tblGrid>
-      <w:tr>
-        <w:trPr>
-          <w:trHeight w:val="10200" w:hRule="atLeast"/>
-        </w:trPr>
-        <w:tc>
-          <w:tcPr>
-            <w:tcW w:type="dxa" w:w="9026"/>
-            <w:shd w:val="clear" w:color="auto" w:fill="FFFFFF"/>
-            <w:tcMar>
-              <w:top w:w="560" w:type="dxa"/>
-              <w:left w:w="1100" w:type="dxa"/>
-              <w:bottom w:w="560" w:type="dxa"/>
-              <w:right w:w="1100" w:type="dxa"/>
-            </w:tcMar>
-          </w:tcPr>
-          <w:p>
-            <w:pPr>
-              <w:spacing w:before="0" w:after="120"/>
-            </w:pPr>
-            <w:r>
-              <w:rPr>
-                <w:rFonts w:ascii="Garamond" w:hAnsi="Garamond"/>
-                <w:color w:val="1E1E1E"/>
-                <w:sz w:val="22"/>
-              </w:rPr>
-              <w:t xml:space="preserve">Exmo.(a) Sr.(a) </w:t>
-            </w:r>
-            <w:r>
-              <w:rPr>
-                <w:rFonts w:ascii="Garamond" w:hAnsi="Garamond"/>
-                <w:color w:val="666666"/>
-                <w:sz w:val="22"/>
-              </w:rPr>
-              <w:t>__________________________________________</w:t>
-            </w:r>
-          </w:p>
-          <w:p>
-            <w:pPr>
-              <w:spacing w:before="0" w:after="360"/>
-            </w:pPr>
-            <w:r>
-              <w:rPr>
-                <w:rFonts w:ascii="Garamond" w:hAnsi="Garamond"/>
-                <w:color w:val="666666"/>
-                <w:sz w:val="20"/>
-              </w:rPr>
-              <w:t>Curitiba/PR, _____ de __________________ de 20_____</w:t>
-            </w:r>
-          </w:p>
-          <w:p>
-            <w:pPr>
-              <w:spacing w:before="0" w:after="0"/>
-              <w:pBdr>
-                <w:bottom w:val="single" w:sz="4" w:space="1" w:color="B89B6A"/>
-              </w:pBdr>
-            </w:pPr>
-          </w:p>
-          <w:p>
-            <w:pPr>
-              <w:spacing w:before="360" w:after="120"/>
-              <w:jc w:val="center"/>
-            </w:pPr>
-            <w:r>
-              <w:rPr>
-                <w:rFonts w:ascii="Garamond" w:hAnsi="Garamond"/>
-                <w:b/>
-                <w:color w:val="1E1E1E"/>
-                <w:sz w:val="28"/>
-              </w:rPr>
-              <w:t>TÍTULO DO DOCUMENTO / PETIÇÃO</w:t>
-            </w:r>
-          </w:p>
-          <w:p>
-            <w:pPr>
-              <w:spacing w:after="400"/>
-              <w:jc w:val="center"/>
-            </w:pPr>
-            <w:r>
-              <w:rPr>
-                <w:rFonts w:ascii="Garamond" w:hAnsi="Garamond"/>
-                <w:color w:val="B89B6A"/>
-                <w:sz w:val="18"/>
-              </w:rPr>
-              <w:t>Processo nº: ______________________ | Vara: ______________________</w:t>
-            </w:r>
-          </w:p>
-          <w:p>
-            <w:pPr>
-              <w:spacing w:before="0" w:after="0"/>
-              <w:pBdr>
-                <w:bottom w:val="single" w:sz="4" w:space="1" w:color="B89B6A"/>
-              </w:pBdr>
-            </w:pPr>
-          </w:p>
-          <w:p>
-            <w:pPr>
-              <w:spacing w:before="320" w:after="200"/>
-              <w:ind w:firstLine="709"/>
-              <w:jc w:val="both"/>
-            </w:pPr>
-            <w:r>
-              <w:rPr>
-                <w:rFonts w:ascii="Garamond" w:hAnsi="Garamond"/>
-                <w:color w:val="1E1E1E"/>
-                <w:sz w:val="22"/>
-              </w:rPr>
-              <w:t>Vem respeitosamente à presença de Vossa Excelência, por meio de seu advogado regularmente constituído, nos termos da procuração que se acosta, expor e requerer o quanto segue:</w:t>
-            </w:r>
-          </w:p>
-          <w:p>
-            <w:pPr>
-              <w:spacing w:before="0" w:after="200"/>
-              <w:ind w:firstLine="709"/>
-              <w:jc w:val="both"/>
-            </w:pPr>
-            <w:r>
-              <w:rPr>
-                <w:rFonts w:ascii="Garamond" w:hAnsi="Garamond"/>
-                <w:color w:val="1E1E1E"/>
-                <w:sz w:val="22"/>
-              </w:rPr>
-              <w:t>Lorem ipsum dolor sit amet, consectetur adipiscing elit. Atuação especializada na Lei do Superendividamento. Analisamos contratos, evitamos abusos bancários e reestruturamos o passivo com absoluto sigilo e rigor técnico jurídico.</w:t>
-            </w:r>
-          </w:p>
-          <w:p>
-            <w:pPr>
-              <w:spacing w:before="0" w:after="200"/>
-              <w:ind w:firstLine="709"/>
-              <w:jc w:val="both"/>
-            </w:pPr>
-            <w:r>
-              <w:rPr>
-                <w:rFonts w:ascii="Garamond" w:hAnsi="Garamond"/>
-                <w:color w:val="1E1E1E"/>
-                <w:sz w:val="22"/>
-              </w:rPr>
-              <w:t>Lorem ipsum dolor sit amet, consectetur adipiscing elit. Atuação especializada na Lei do Superendividamento. Analisamos contratos, evitamos abusos bancários e reestruturamos o passivo com absoluto sigilo e rigor técnico jurídico.</w:t>
-            </w:r>
-          </w:p>
-          <w:p>
-            <w:pPr>
-              <w:spacing w:before="0" w:after="200"/>
-              <w:ind w:firstLine="709"/>
-              <w:jc w:val="both"/>
-            </w:pPr>
-            <w:r>
-              <w:rPr>
-                <w:rFonts w:ascii="Garamond" w:hAnsi="Garamond"/>
-                <w:color w:val="1E1E1E"/>
-                <w:sz w:val="22"/>
-              </w:rPr>
-              <w:t>Lorem ipsum dolor sit amet, consectetur adipiscing elit. Atuação especializada na Lei do Superendividamento. Analisamos contratos, evitamos abusos bancários e reestruturamos o passivo com absoluto sigilo e rigor técnico jurídico.</w:t>
-            </w:r>
-          </w:p>
-          <w:p>
-            <w:pPr>
-              <w:spacing w:before="0" w:after="200"/>
-              <w:ind w:firstLine="709"/>
-              <w:jc w:val="both"/>
-            </w:pPr>
-            <w:r>
-              <w:rPr>
-                <w:rFonts w:ascii="Garamond" w:hAnsi="Garamond"/>
-                <w:color w:val="1E1E1E"/>
-                <w:sz w:val="22"/>
-              </w:rPr>
-              <w:t>Lorem ipsum dolor sit amet, consectetur adipiscing elit. Atuação especializada na Lei do Superendividamento. Analisamos contratos, evitamos abusos bancários e reestruturamos o passivo com absoluto sigilo e rigor técnico jurídico.</w:t>
-            </w:r>
-          </w:p>
-          <w:p>
-            <w:pPr>
-              <w:spacing w:before="280" w:after="120"/>
-            </w:pPr>
-            <w:r>
-              <w:rPr>
-                <w:rFonts w:ascii="Garamond" w:hAnsi="Garamond"/>
-                <w:b/>
-                <w:color w:val="B89B6A"/>
-                <w:sz w:val="22"/>
-              </w:rPr>
-              <w:t>DOS REQUERIMENTOS</w:t>
-            </w:r>
-          </w:p>
-          <w:p>
-            <w:pPr>
-              <w:spacing w:before="0" w:after="320"/>
-              <w:ind w:firstLine="709"/>
-              <w:jc w:val="both"/>
-            </w:pPr>
-            <w:r>
-              <w:rPr>
-                <w:rFonts w:ascii="Garamond" w:hAnsi="Garamond"/>
-                <w:color w:val="1E1E1E"/>
-                <w:sz w:val="22"/>
-              </w:rPr>
-              <w:t>Diante do exposto, requer a Vossa Excelência o deferimento do presente pedido, em consonância com os princípios da dignidade da pessoa humana e da proteção ao mínimo existencial.</w:t>
-            </w:r>
-          </w:p>
-          <w:p>
-            <w:pPr>
-              <w:spacing w:after="600"/>
-            </w:pPr>
-            <w:r>
-              <w:rPr>
-                <w:rFonts w:ascii="Garamond" w:hAnsi="Garamond"/>
-                <w:color w:val="1E1E1E"/>
-                <w:sz w:val="22"/>
-              </w:rPr>
-              <w:t>Termos em que pede deferimento.</w:t>
-            </w:r>
-          </w:p>
-          <w:p>
-            <w:pPr>
-              <w:spacing w:after="600"/>
-            </w:pPr>
-            <w:r>
-              <w:rPr>
-                <w:rFonts w:ascii="Garamond" w:hAnsi="Garamond"/>
-                <w:color w:val="1E1E1E"/>
-                <w:sz w:val="22"/>
-              </w:rPr>
-              <w:t>Curitiba/PR, _____ de __________________ de 20_____.</w:t>
-            </w:r>
-          </w:p>
-          <w:p>
-            <w:pPr>
-              <w:spacing w:after="80"/>
-              <w:jc w:val="center"/>
-            </w:pPr>
-            <w:r>
-              <w:rPr>
-                <w:rFonts w:ascii="Garamond" w:hAnsi="Garamond"/>
-                <w:color w:val="B89B6A"/>
-              </w:rPr>
-              <w:t>_____________________________________________</w:t>
-            </w:r>
-          </w:p>
-          <w:p>
-            <w:pPr>
-              <w:spacing w:after="40"/>
-              <w:jc w:val="center"/>
-            </w:pPr>
-            <w:r>
-              <w:rPr>
-                <w:rFonts w:ascii="Garamond" w:hAnsi="Garamond"/>
-                <w:b/>
-                <w:color w:val="1E1E1E"/>
-                <w:sz w:val="20"/>
-              </w:rPr>
-              <w:t>Advogado(a) Responsável</w:t>
-            </w:r>
-          </w:p>
-          <w:p>
-            <w:pPr>
-              <w:jc w:val="center"/>
-            </w:pPr>
-            <w:r>
-              <w:rPr>
-                <w:rFonts w:ascii="Garamond" w:hAnsi="Garamond"/>
-                <w:color w:val="B89B6A"/>
-                <w:sz w:val="18"/>
-              </w:rPr>
-              <w:t>OAB/PR 118.596 | JCPV Advocacia</w:t>
-            </w:r>
-          </w:p>
-        </w:tc>
-      </w:tr>
-    </w:tbl>
-    <w:tbl>
-      <w:tblPr>
-        <w:tblW w:type="auto" w:w="0"/>
-        <w:tblLook w:firstColumn="1" w:firstRow="1" w:lastColumn="0" w:lastRow="0" w:noHBand="0" w:noVBand="1" w:val="04A0"/>
-        <w:tblBorders>
-          <w:top w:val="none" w:sz="0" w:space="0" w:color="auto"/>
-          <w:left w:val="none" w:sz="0" w:space="0" w:color="auto"/>
-          <w:bottom w:val="none" w:sz="0" w:space="0" w:color="auto"/>
-          <w:right w:val="none" w:sz="0" w:space="0" w:color="auto"/>
-          <w:insideH w:val="none" w:sz="0" w:space="0" w:color="auto"/>
-          <w:insideV w:val="none" w:sz="0" w:space="0" w:color="auto"/>
-        </w:tblBorders>
-        <w:tblW w:w="11906" w:type="dxa"/>
-      </w:tblPr>
-      <w:tblGrid>
-        <w:gridCol w:w="9026"/>
-      </w:tblGrid>
-      <w:tr>
-        <w:trPr>
-          <w:trHeight w:val="50" w:hRule="exact"/>
-        </w:trPr>
-        <w:tc>
-          <w:tcPr>
-            <w:tcW w:type="dxa" w:w="9026"/>
-            <w:shd w:val="clear" w:color="auto" w:fill="B89B6A"/>
-          </w:tcPr>
-          <w:p>
-            <w:r/>
-          </w:p>
-        </w:tc>
-      </w:tr>
-    </w:tbl>
-    <w:tbl>
-      <w:tblPr>
-        <w:tblW w:type="auto" w:w="0"/>
-        <w:tblLook w:firstColumn="1" w:firstRow="1" w:lastColumn="0" w:lastRow="0" w:noHBand="0" w:noVBand="1" w:val="04A0"/>
-        <w:tblBorders>
-          <w:top w:val="none" w:sz="0" w:space="0" w:color="auto"/>
-          <w:left w:val="none" w:sz="0" w:space="0" w:color="auto"/>
-          <w:bottom w:val="none" w:sz="0" w:space="0" w:color="auto"/>
-          <w:right w:val="none" w:sz="0" w:space="0" w:color="auto"/>
-          <w:insideH w:val="none" w:sz="0" w:space="0" w:color="auto"/>
-          <w:insideV w:val="none" w:sz="0" w:space="0" w:color="auto"/>
-        </w:tblBorders>
-        <w:tblW w:w="11906" w:type="dxa"/>
-      </w:tblPr>
-      <w:tblGrid>
-        <w:gridCol w:w="9026"/>
-      </w:tblGrid>
-      <w:tr>
-        <w:trPr>
-          <w:trHeight w:val="900" w:hRule="atLeast"/>
-        </w:trPr>
-        <w:tc>
-          <w:tcPr>
-            <w:tcW w:type="dxa" w:w="9026"/>
-            <w:shd w:val="clear" w:color="auto" w:fill="1E1E1E"/>
-            <w:tcMar>
-              <w:top w:w="280" w:type="dxa"/>
-              <w:left w:w="720" w:type="dxa"/>
-              <w:bottom w:w="280" w:type="dxa"/>
-              <w:right w:w="720" w:type="dxa"/>
-            </w:tcMar>
-          </w:tcPr>
-          <w:p>
-            <w:pPr>
-              <w:spacing w:before="0" w:after="60"/>
-              <w:jc w:val="center"/>
-            </w:pPr>
-            <w:r>
-              <w:rPr>
-                <w:rFonts w:ascii="Garamond" w:hAnsi="Garamond"/>
-                <w:b/>
-                <w:color w:val="B89B6A"/>
-                <w:sz w:val="22"/>
-              </w:rPr>
-              <w:t>JCPV  ADVOCACIA</w:t>
-            </w:r>
-          </w:p>
-          <w:p>
-            <w:pPr>
-              <w:spacing w:before="0" w:after="60"/>
-              <w:jc w:val="center"/>
-            </w:pPr>
-            <w:r>
-              <w:rPr>
-                <w:rFonts w:ascii="Garamond" w:hAnsi="Garamond"/>
-                <w:color w:val="C8B899"/>
-                <w:sz w:val="16"/>
-              </w:rPr>
-              <w:t>www.jcpvadvocacia.com.br</w:t>
-            </w:r>
-          </w:p>
-          <w:p>
-            <w:pPr>
-              <w:spacing w:before="0" w:after="0"/>
-              <w:jc w:val="center"/>
-            </w:pPr>
-            <w:r>
-              <w:rPr>
-                <w:rFonts w:ascii="Garamond" w:hAnsi="Garamond"/>
-                <w:color w:val="B89B6A"/>
-                <w:sz w:val="15"/>
-              </w:rPr>
-              <w:t>Alta Performance Jurídica  ·  Sigilo Absoluto  ·  Segurança Jurídica  ·  Atuação Nacional</w:t>
-            </w:r>
-          </w:p>
-        </w:tc>
-      </w:tr>
-    </w:tbl>
+    <w:p>
+      <w:pPr>
+        <w:spacing w:before="0" w:after="480" w:lineRule="exact" w:line="360"/>
+        <w:jc w:val="center"/>
+      </w:pPr>
+      <w:r>
+        <w:rPr>
+          <w:rFonts w:ascii="Times New Roman" w:hAnsi="Times New Roman"/>
+          <w:b/>
+          <w:i w:val="0"/>
+          <w:color w:val="1E1E1E"/>
+          <w:sz w:val="24"/>
+          <w:u w:val="none"/>
+        </w:rPr>
+        <w:t>EXCELENTÍSSIMO(A) SENHOR(A) DOUTOR(A) JUIZ(A) DE DIREITO DA ___ª VARA CÍVEL DA COMARCA DE ________________________________</w:t>
+      </w:r>
+    </w:p>
+    <w:p>
+      <w:pPr>
+        <w:spacing w:before="0" w:after="240" w:lineRule="exact" w:line="360"/>
+        <w:ind w:firstLine="709"/>
+        <w:jc w:val="both"/>
+      </w:pPr>
+      <w:r>
+        <w:rPr>
+          <w:rFonts w:ascii="Times New Roman" w:hAnsi="Times New Roman"/>
+          <w:b w:val="0"/>
+          <w:i w:val="0"/>
+          <w:color w:val="1E1E1E"/>
+          <w:sz w:val="24"/>
+          <w:u w:val="none"/>
+        </w:rPr>
+        <w:t>____________________________________ (nome completo do requerente), nacionalidade, estado civil, profissão, portador(a) do RG nº _____________ e CPF nº __________________, residente e domiciliado(a) na ____________________________________________, nº ______, Bairro __________________, Cidade/UF, CEP ______________, por seu(sua) advogado(a) infra-assinado(a), vem respeitosamente à presença de Vossa Excelência propor a presente:</w:t>
+      </w:r>
+    </w:p>
+    <w:p>
+      <w:pPr>
+        <w:spacing w:before="120" w:after="120" w:line="360" w:lineRule="exact"/>
+        <w:jc w:val="center"/>
+      </w:pPr>
+      <w:r>
+        <w:rPr>
+          <w:rFonts w:ascii="Times New Roman" w:hAnsi="Times New Roman"/>
+          <w:b/>
+          <w:i w:val="0"/>
+          <w:color w:val="1E1E1E"/>
+          <w:sz w:val="24"/>
+          <w:u w:val="single"/>
+        </w:rPr>
+        <w:t>AÇÃO DE __________________________________________</w:t>
+      </w:r>
+    </w:p>
+    <w:p>
+      <w:pPr>
+        <w:spacing w:before="0" w:after="360" w:line="360" w:lineRule="exact"/>
+        <w:jc w:val="center"/>
+      </w:pPr>
+      <w:r>
+        <w:rPr>
+          <w:rFonts w:ascii="Times New Roman" w:hAnsi="Times New Roman"/>
+          <w:b w:val="0"/>
+          <w:i w:val="0"/>
+          <w:color w:val="1E1E1E"/>
+          <w:sz w:val="24"/>
+          <w:u w:val="none"/>
+        </w:rPr>
+        <w:t>em face de ___________________________________________</w:t>
+      </w:r>
+    </w:p>
+    <w:p>
+      <w:pPr>
+        <w:spacing w:before="240" w:after="120" w:line="360" w:lineRule="exact"/>
+        <w:pBdr>
+          <w:bottom w:val="single" w:sz="4" w:space="1" w:color="B89B6A"/>
+        </w:pBdr>
+      </w:pPr>
+      <w:r>
+        <w:rPr>
+          <w:rFonts w:ascii="Times New Roman" w:hAnsi="Times New Roman"/>
+          <w:b/>
+          <w:i w:val="0"/>
+          <w:color w:val="1E1E1E"/>
+          <w:sz w:val="24"/>
+          <w:u w:val="none"/>
+        </w:rPr>
+        <w:t>I – DOS FATOS</w:t>
+      </w:r>
+    </w:p>
+    <w:p>
+      <w:pPr>
+        <w:spacing w:before="0" w:after="120" w:lineRule="exact" w:line="360"/>
+        <w:ind w:firstLine="709"/>
+        <w:jc w:val="both"/>
+      </w:pPr>
+      <w:r>
+        <w:rPr>
+          <w:rFonts w:ascii="Times New Roman" w:hAnsi="Times New Roman"/>
+          <w:b w:val="0"/>
+          <w:i w:val="0"/>
+          <w:color w:val="1E1E1E"/>
+          <w:sz w:val="24"/>
+          <w:u w:val="none"/>
+        </w:rPr>
+        <w:t>Narra o(a) requerente que _________________________________________________________________________________________________________________________________________________________________________, situação que gerou os prejuízos ora descritos e que fundamentam o presente pedido.</w:t>
+      </w:r>
+    </w:p>
+    <w:p>
+      <w:pPr>
+        <w:spacing w:before="0" w:after="240" w:lineRule="exact" w:line="360"/>
+        <w:ind w:firstLine="709"/>
+        <w:jc w:val="both"/>
+      </w:pPr>
+      <w:r>
+        <w:rPr>
+          <w:rFonts w:ascii="Times New Roman" w:hAnsi="Times New Roman"/>
+          <w:b w:val="0"/>
+          <w:i w:val="0"/>
+          <w:color w:val="1E1E1E"/>
+          <w:sz w:val="24"/>
+          <w:u w:val="none"/>
+        </w:rPr>
+        <w:t>Acrescenta ainda que ________________________________________________________________________________________________________________________________________________________________, razão pela qual busca a tutela jurisdicional para proteção de seus direitos.</w:t>
+      </w:r>
+    </w:p>
+    <w:p>
+      <w:pPr>
+        <w:spacing w:before="240" w:after="120" w:line="360" w:lineRule="exact"/>
+        <w:pBdr>
+          <w:bottom w:val="single" w:sz="4" w:space="1" w:color="B89B6A"/>
+        </w:pBdr>
+      </w:pPr>
+      <w:r>
+        <w:rPr>
+          <w:rFonts w:ascii="Times New Roman" w:hAnsi="Times New Roman"/>
+          <w:b/>
+          <w:i w:val="0"/>
+          <w:color w:val="1E1E1E"/>
+          <w:sz w:val="24"/>
+          <w:u w:val="none"/>
+        </w:rPr>
+        <w:t>II – DO DIREITO</w:t>
+      </w:r>
+    </w:p>
+    <w:p>
+      <w:pPr>
+        <w:spacing w:before="0" w:after="120" w:lineRule="exact" w:line="360"/>
+        <w:ind w:firstLine="709"/>
+        <w:jc w:val="both"/>
+      </w:pPr>
+      <w:r>
+        <w:rPr>
+          <w:rFonts w:ascii="Times New Roman" w:hAnsi="Times New Roman"/>
+          <w:b w:val="0"/>
+          <w:i w:val="0"/>
+          <w:color w:val="1E1E1E"/>
+          <w:sz w:val="24"/>
+          <w:u w:val="none"/>
+        </w:rPr>
+        <w:t>A pretensão deduzida encontra amparo na Lei nº _____________________, bem como nos princípios constitucionais da dignidade da pessoa humana (art. 1º, III, CF/88), da proteção ao mínimo existencial e nos demais dispositivos legais aplicáveis à espécie.</w:t>
+      </w:r>
+    </w:p>
+    <w:p>
+      <w:pPr>
+        <w:spacing w:before="0" w:after="240" w:lineRule="exact" w:line="360"/>
+        <w:ind w:firstLine="709"/>
+        <w:jc w:val="both"/>
+      </w:pPr>
+      <w:r>
+        <w:rPr>
+          <w:rFonts w:ascii="Times New Roman" w:hAnsi="Times New Roman"/>
+          <w:b w:val="0"/>
+          <w:i w:val="0"/>
+          <w:color w:val="1E1E1E"/>
+          <w:sz w:val="24"/>
+          <w:u w:val="none"/>
+        </w:rPr>
+        <w:t>Ademais, a jurisprudência pátria tem se posicionado no sentido de __________________________________________________________________________________________________, conforme reiteradas decisões do Colendo Superior Tribunal de Justiça.</w:t>
+      </w:r>
+    </w:p>
+    <w:p>
+      <w:pPr>
+        <w:spacing w:before="240" w:after="120" w:line="360" w:lineRule="exact"/>
+        <w:pBdr>
+          <w:bottom w:val="single" w:sz="4" w:space="1" w:color="B89B6A"/>
+        </w:pBdr>
+      </w:pPr>
+      <w:r>
+        <w:rPr>
+          <w:rFonts w:ascii="Times New Roman" w:hAnsi="Times New Roman"/>
+          <w:b/>
+          <w:i w:val="0"/>
+          <w:color w:val="1E1E1E"/>
+          <w:sz w:val="24"/>
+          <w:u w:val="none"/>
+        </w:rPr>
+        <w:t>III – DOS PEDIDOS</w:t>
+      </w:r>
+    </w:p>
+    <w:p>
+      <w:pPr>
+        <w:spacing w:before="0" w:after="120" w:lineRule="exact" w:line="360"/>
+        <w:ind w:firstLine="709"/>
+        <w:jc w:val="both"/>
+      </w:pPr>
+      <w:r>
+        <w:rPr>
+          <w:rFonts w:ascii="Times New Roman" w:hAnsi="Times New Roman"/>
+          <w:b w:val="0"/>
+          <w:i w:val="0"/>
+          <w:color w:val="1E1E1E"/>
+          <w:sz w:val="24"/>
+          <w:u w:val="none"/>
+        </w:rPr>
+        <w:t>Diante do exposto, requer a Vossa Excelência que se digne a:</w:t>
+      </w:r>
+    </w:p>
+    <w:p>
+      <w:pPr>
+        <w:spacing w:before="40" w:after="80" w:lineRule="exact" w:line="360"/>
+        <w:jc w:val="both"/>
+      </w:pPr>
+      <w:r>
+        <w:rPr>
+          <w:rFonts w:ascii="Times New Roman" w:hAnsi="Times New Roman"/>
+          <w:b w:val="0"/>
+          <w:i w:val="0"/>
+          <w:color w:val="1E1E1E"/>
+          <w:sz w:val="24"/>
+          <w:u w:val="none"/>
+        </w:rPr>
+        <w:t>a) Receber e processar a presente ação, determinando a citação da parte requerida;</w:t>
+      </w:r>
+    </w:p>
+    <w:p>
+      <w:pPr>
+        <w:spacing w:before="40" w:after="80" w:lineRule="exact" w:line="360"/>
+        <w:jc w:val="both"/>
+      </w:pPr>
+      <w:r>
+        <w:rPr>
+          <w:rFonts w:ascii="Times New Roman" w:hAnsi="Times New Roman"/>
+          <w:b w:val="0"/>
+          <w:i w:val="0"/>
+          <w:color w:val="1E1E1E"/>
+          <w:sz w:val="24"/>
+          <w:u w:val="none"/>
+        </w:rPr>
+        <w:t>b) Conceder os benefícios da justiça gratuita, nos termos do art. 98 do CPC/2015;</w:t>
+      </w:r>
+    </w:p>
+    <w:p>
+      <w:pPr>
+        <w:spacing w:before="40" w:after="80" w:lineRule="exact" w:line="360"/>
+        <w:jc w:val="both"/>
+      </w:pPr>
+      <w:r>
+        <w:rPr>
+          <w:rFonts w:ascii="Times New Roman" w:hAnsi="Times New Roman"/>
+          <w:b w:val="0"/>
+          <w:i w:val="0"/>
+          <w:color w:val="1E1E1E"/>
+          <w:sz w:val="24"/>
+          <w:u w:val="none"/>
+        </w:rPr>
+        <w:t>c) Ao final, julgar TOTALMENTE PROCEDENTE o pedido, para que ________________________;</w:t>
+      </w:r>
+    </w:p>
+    <w:p>
+      <w:pPr>
+        <w:spacing w:before="40" w:after="80" w:lineRule="exact" w:line="360"/>
+        <w:jc w:val="both"/>
+      </w:pPr>
+      <w:r>
+        <w:rPr>
+          <w:rFonts w:ascii="Times New Roman" w:hAnsi="Times New Roman"/>
+          <w:b w:val="0"/>
+          <w:i w:val="0"/>
+          <w:color w:val="1E1E1E"/>
+          <w:sz w:val="24"/>
+          <w:u w:val="none"/>
+        </w:rPr>
+        <w:t>d) Condenar a parte requerida ao pagamento das custas processuais e honorários advocatícios, nos termos do art. 85 do CPC/2015.</w:t>
+      </w:r>
+    </w:p>
+    <w:p>
+      <w:pPr>
+        <w:spacing w:before="0" w:after="120" w:lineRule="exact" w:line="360"/>
+        <w:ind w:firstLine="709"/>
+        <w:jc w:val="both"/>
+      </w:pPr>
+    </w:p>
+    <w:p>
+      <w:pPr>
+        <w:spacing w:before="120" w:after="240" w:lineRule="exact" w:line="360"/>
+        <w:ind w:firstLine="709"/>
+        <w:jc w:val="both"/>
+      </w:pPr>
+      <w:r>
+        <w:rPr>
+          <w:rFonts w:ascii="Times New Roman" w:hAnsi="Times New Roman"/>
+          <w:b w:val="0"/>
+          <w:i w:val="0"/>
+          <w:color w:val="1E1E1E"/>
+          <w:sz w:val="24"/>
+          <w:u w:val="none"/>
+        </w:rPr>
+        <w:t>Dá-se à causa o valor de R$ _________________ (___________________________________________).</w:t>
+      </w:r>
+    </w:p>
+    <w:p>
+      <w:pPr>
+        <w:spacing w:before="120" w:after="120" w:lineRule="exact" w:line="360"/>
+        <w:ind w:firstLine="709"/>
+        <w:jc w:val="both"/>
+      </w:pPr>
+      <w:r>
+        <w:rPr>
+          <w:rFonts w:ascii="Times New Roman" w:hAnsi="Times New Roman"/>
+          <w:b w:val="0"/>
+          <w:i w:val="0"/>
+          <w:color w:val="1E1E1E"/>
+          <w:sz w:val="24"/>
+          <w:u w:val="none"/>
+        </w:rPr>
+        <w:t>Nestes termos, pede e espera deferimento.</w:t>
+      </w:r>
+    </w:p>
+    <w:p>
+      <w:pPr>
+        <w:spacing w:before="120" w:after="720" w:line="360" w:lineRule="exact"/>
+        <w:jc w:val="right"/>
+      </w:pPr>
+      <w:r>
+        <w:rPr>
+          <w:rFonts w:ascii="Times New Roman" w:hAnsi="Times New Roman"/>
+          <w:b w:val="0"/>
+          <w:i w:val="0"/>
+          <w:color w:val="1E1E1E"/>
+          <w:sz w:val="24"/>
+          <w:u w:val="none"/>
+        </w:rPr>
+        <w:t>Curitiba/PR, _____ de ________________________ de 20___.</w:t>
+      </w:r>
+    </w:p>
+    <w:p>
+      <w:pPr>
+        <w:spacing w:after="40"/>
+        <w:jc w:val="center"/>
+      </w:pPr>
+      <w:r>
+        <w:rPr>
+          <w:rFonts w:ascii="Times New Roman" w:hAnsi="Times New Roman"/>
+          <w:b w:val="0"/>
+          <w:i w:val="0"/>
+          <w:color w:val="B89B6A"/>
+          <w:sz w:val="24"/>
+          <w:u w:val="none"/>
+        </w:rPr>
+        <w:t>________________________________________</w:t>
+      </w:r>
+    </w:p>
+    <w:p>
+      <w:pPr>
+        <w:spacing w:after="40"/>
+        <w:jc w:val="center"/>
+      </w:pPr>
+      <w:r>
+        <w:rPr>
+          <w:rFonts w:ascii="Times New Roman" w:hAnsi="Times New Roman"/>
+          <w:b/>
+          <w:i w:val="0"/>
+          <w:color w:val="1E1E1E"/>
+          <w:sz w:val="24"/>
+          <w:u w:val="none"/>
+        </w:rPr>
+        <w:t>Advogado(a) Responsável</w:t>
+      </w:r>
+    </w:p>
+    <w:p>
+      <w:pPr>
+        <w:spacing w:after="40"/>
+        <w:jc w:val="center"/>
+      </w:pPr>
+      <w:r>
+        <w:rPr>
+          <w:rFonts w:ascii="Times New Roman" w:hAnsi="Times New Roman"/>
+          <w:b w:val="0"/>
+          <w:i w:val="0"/>
+          <w:color w:val="B89B6A"/>
+          <w:sz w:val="22"/>
+          <w:u w:val="none"/>
+        </w:rPr>
+        <w:t>OAB/PR 118.596</w:t>
+      </w:r>
+    </w:p>
+    <w:p>
+      <w:pPr>
+        <w:jc w:val="center"/>
+      </w:pPr>
+      <w:r>
+        <w:rPr>
+          <w:rFonts w:ascii="Times New Roman" w:hAnsi="Times New Roman"/>
+          <w:b w:val="0"/>
+          <w:i w:val="0"/>
+          <w:color w:val="888888"/>
+          <w:sz w:val="20"/>
+          <w:u w:val="none"/>
+        </w:rPr>
+        <w:t>JCPV ADVOCACIA  ·  www.jcpvadvocacia.com.br</w:t>
+      </w:r>
+    </w:p>
     <w:sectPr>
+      <w:headerReference w:type="default" r:id="rId9"/>
+      <w:footerReference w:type="default" r:id="rId10"/>
       <w:pgSz w:w="11906" w:h="16838"/>
-      <w:pgMar w:top="0" w:right="0" w:bottom="0" w:left="0" w:header="720" w:footer="720" w:gutter="0"/>
+      <w:pgMar w:top="1701" w:right="1134" w:bottom="1134" w:left="1701" w:header="567" w:footer="567" w:gutter="0"/>
       <w:cols w:space="720"/>
       <w:docGrid w:linePitch="360"/>
     </w:sectPr>
   </w:body>
 </w:document>
+</file>
+
+<file path=word/footer1.xml><?xml version="1.0" encoding="utf-8"?>
+<w:ftr xmlns:m="http://schemas.openxmlformats.org/officeDocument/2006/math" xmlns:mc="http://schemas.openxmlformats.org/markup-compatibility/2006" xmlns:mo="http://schemas.microsoft.com/office/mac/office/2008/main" xmlns:mv="urn:schemas-microsoft-com:mac:vml" xmlns:o="urn:schemas-microsoft-com:office:office" xmlns:r="http://schemas.openxmlformats.org/officeDocument/2006/relationships" xmlns:v="urn:schemas-microsoft-com:vml" xmlns:w10="urn:schemas-microsoft-com:office:word" xmlns:w14="http://schemas.microsoft.com/office/word/2010/wordml" xmlns:w="http://schemas.openxmlformats.org/wordprocessingml/2006/main" xmlns:wne="http://schemas.microsoft.com/office/word/2006/wordml" xmlns:wp14="http://schemas.microsoft.com/office/word/2010/wordprocessingDrawing" xmlns:wp="http://schemas.openxmlformats.org/drawingml/2006/wordprocessingDrawing" xmlns:wpc="http://schemas.microsoft.com/office/word/2010/wordprocessingCanvas" xmlns:wpg="http://schemas.microsoft.com/office/word/2010/wordprocessingGroup" xmlns:wpi="http://schemas.microsoft.com/office/word/2010/wordprocessingInk" xmlns:wps="http://schemas.microsoft.com/office/word/2010/wordprocessingShape" mc:Ignorable="w14 wp14">
+  <w:tbl>
+    <w:tblPr>
+      <w:tblW w:type="auto" w:w="0"/>
+      <w:tblLook w:firstColumn="1" w:firstRow="1" w:lastColumn="0" w:lastRow="0" w:noHBand="0" w:noVBand="1" w:val="04A0"/>
+      <w:tblBorders>
+        <w:top w:val="none" w:sz="0" w:space="0" w:color="auto"/>
+        <w:left w:val="none" w:sz="0" w:space="0" w:color="auto"/>
+        <w:bottom w:val="none" w:sz="0" w:space="0" w:color="auto"/>
+        <w:right w:val="none" w:sz="0" w:space="0" w:color="auto"/>
+        <w:insideH w:val="none" w:sz="0" w:space="0" w:color="auto"/>
+        <w:insideV w:val="none" w:sz="0" w:space="0" w:color="auto"/>
+      </w:tblBorders>
+      <w:tblW w:w="5000" w:type="pct"/>
+    </w:tblPr>
+    <w:tblGrid>
+      <w:gridCol w:w="11906"/>
+    </w:tblGrid>
+    <w:tr>
+      <w:trPr>
+        <w:trHeight w:val="900" w:hRule="atLeast"/>
+      </w:trPr>
+      <w:tc>
+        <w:tcPr>
+          <w:tcW w:type="dxa" w:w="11906"/>
+          <w:shd w:val="clear" w:color="auto" w:fill="1E1E1E"/>
+          <w:tcMar>
+            <w:top w:w="200" w:type="dxa"/>
+            <w:left w:w="500" w:type="dxa"/>
+            <w:bottom w:w="200" w:type="dxa"/>
+            <w:right w:w="500" w:type="dxa"/>
+          </w:tcMar>
+        </w:tcPr>
+        <w:p>
+          <w:pPr>
+            <w:spacing w:before="0" w:after="0"/>
+            <w:jc w:val="center"/>
+            <w:pBdr>
+              <w:bottom w:val="single" w:sz="6" w:space="1" w:color="B89B6A"/>
+            </w:pBdr>
+          </w:pPr>
+          <w:r>
+            <w:rPr>
+              <w:rFonts w:ascii="Garamond" w:hAnsi="Garamond"/>
+              <w:b w:val="0"/>
+              <w:i w:val="0"/>
+              <w:sz w:val="2"/>
+              <w:u w:val="none"/>
+            </w:rPr>
+          </w:r>
+        </w:p>
+        <w:p>
+          <w:pPr>
+            <w:spacing w:before="80" w:after="0"/>
+            <w:jc w:val="center"/>
+          </w:pPr>
+          <w:r>
+            <w:rPr>
+              <w:rFonts w:ascii="Garamond" w:hAnsi="Garamond"/>
+              <w:b/>
+              <w:i w:val="0"/>
+              <w:color w:val="B89B6A"/>
+              <w:sz w:val="20"/>
+              <w:u w:val="none"/>
+            </w:rPr>
+            <w:t>JCPV  ADVOCACIA</w:t>
+          </w:r>
+        </w:p>
+        <w:p>
+          <w:pPr>
+            <w:spacing w:before="0" w:after="0"/>
+            <w:jc w:val="center"/>
+          </w:pPr>
+          <w:r>
+            <w:rPr>
+              <w:rFonts w:ascii="Garamond" w:hAnsi="Garamond"/>
+              <w:b w:val="0"/>
+              <w:i w:val="0"/>
+              <w:color w:val="CCBB99"/>
+              <w:sz w:val="16"/>
+              <w:u w:val="none"/>
+            </w:rPr>
+            <w:t>www.jcpvadvocacia.com.br</w:t>
+          </w:r>
+        </w:p>
+      </w:tc>
+    </w:tr>
+  </w:tbl>
+  <w:tbl>
+    <w:tblPr>
+      <w:tblW w:type="auto" w:w="0"/>
+      <w:tblLook w:firstColumn="1" w:firstRow="1" w:lastColumn="0" w:lastRow="0" w:noHBand="0" w:noVBand="1" w:val="04A0"/>
+      <w:tblBorders>
+        <w:top w:val="none" w:sz="0" w:space="0" w:color="auto"/>
+        <w:left w:val="none" w:sz="0" w:space="0" w:color="auto"/>
+        <w:bottom w:val="none" w:sz="0" w:space="0" w:color="auto"/>
+        <w:right w:val="none" w:sz="0" w:space="0" w:color="auto"/>
+        <w:insideH w:val="none" w:sz="0" w:space="0" w:color="auto"/>
+        <w:insideV w:val="none" w:sz="0" w:space="0" w:color="auto"/>
+      </w:tblBorders>
+      <w:tblW w:w="5000" w:type="pct"/>
+    </w:tblPr>
+    <w:tblGrid>
+      <w:gridCol w:w="3969"/>
+      <w:gridCol w:w="3969"/>
+      <w:gridCol w:w="3969"/>
+    </w:tblGrid>
+    <w:tr>
+      <w:tc>
+        <w:tcPr>
+          <w:tcW w:type="dxa" w:w="3969"/>
+          <w:shd w:val="clear" w:color="auto" w:fill="1E1E1E"/>
+          <w:tcMar>
+            <w:top w:w="80" w:type="dxa"/>
+            <w:left w:w="400" w:type="dxa"/>
+            <w:bottom w:w="120" w:type="dxa"/>
+            <w:right w:w="400" w:type="dxa"/>
+          </w:tcMar>
+        </w:tcPr>
+        <w:p>
+          <w:pPr>
+            <w:spacing w:before="0" w:after="0"/>
+            <w:jc w:val="left"/>
+          </w:pPr>
+          <w:r>
+            <w:rPr>
+              <w:rFonts w:ascii="Garamond" w:hAnsi="Garamond"/>
+              <w:b w:val="0"/>
+              <w:i w:val="0"/>
+              <w:color w:val="B89B6A"/>
+              <w:sz w:val="15"/>
+              <w:u w:val="none"/>
+            </w:rPr>
+            <w:t>OAB/PR 118.596</w:t>
+          </w:r>
+        </w:p>
+      </w:tc>
+      <w:tc>
+        <w:tcPr>
+          <w:tcW w:type="dxa" w:w="3969"/>
+          <w:shd w:val="clear" w:color="auto" w:fill="1E1E1E"/>
+          <w:tcMar>
+            <w:top w:w="80" w:type="dxa"/>
+            <w:left w:w="400" w:type="dxa"/>
+            <w:bottom w:w="120" w:type="dxa"/>
+            <w:right w:w="400" w:type="dxa"/>
+          </w:tcMar>
+        </w:tcPr>
+        <w:p>
+          <w:pPr>
+            <w:spacing w:before="0" w:after="0"/>
+            <w:jc w:val="center"/>
+          </w:pPr>
+          <w:r>
+            <w:rPr>
+              <w:rFonts w:ascii="Garamond" w:hAnsi="Garamond"/>
+              <w:b w:val="0"/>
+              <w:i w:val="0"/>
+              <w:color w:val="B89B6A"/>
+              <w:sz w:val="15"/>
+              <w:u w:val="none"/>
+            </w:rPr>
+            <w:t>Sigilo Absoluto  ·  Segurança Jurídica</w:t>
+          </w:r>
+        </w:p>
+      </w:tc>
+      <w:tc>
+        <w:tcPr>
+          <w:tcW w:type="dxa" w:w="3969"/>
+          <w:shd w:val="clear" w:color="auto" w:fill="1E1E1E"/>
+          <w:tcMar>
+            <w:top w:w="80" w:type="dxa"/>
+            <w:left w:w="400" w:type="dxa"/>
+            <w:bottom w:w="120" w:type="dxa"/>
+            <w:right w:w="400" w:type="dxa"/>
+          </w:tcMar>
+        </w:tcPr>
+        <w:p>
+          <w:pPr>
+            <w:spacing w:before="0" w:after="0"/>
+            <w:jc w:val="right"/>
+          </w:pPr>
+          <w:r>
+            <w:rPr>
+              <w:rFonts w:ascii="Garamond" w:hAnsi="Garamond"/>
+              <w:b w:val="0"/>
+              <w:i w:val="0"/>
+              <w:color w:val="B89B6A"/>
+              <w:sz w:val="15"/>
+              <w:u w:val="none"/>
+            </w:rPr>
+            <w:t xml:space="preserve">Pág. </w:t>
+          </w:r>
+          <w:r>
+            <w:rPr>
+              <w:rFonts w:ascii="Garamond" w:hAnsi="Garamond"/>
+              <w:color w:val="B89B6A"/>
+              <w:sz w:val="15"/>
+            </w:rPr>
+            <w:fldChar w:fldCharType="begin"/>
+            <w:instrText>PAGE</w:instrText>
+            <w:fldChar w:fldCharType="end"/>
+          </w:r>
+        </w:p>
+      </w:tc>
+    </w:tr>
+  </w:tbl>
+</w:ftr>
+</file>
+
+<file path=word/header1.xml><?xml version="1.0" encoding="utf-8"?>
+<w:hdr xmlns:m="http://schemas.openxmlformats.org/officeDocument/2006/math" xmlns:mc="http://schemas.openxmlformats.org/markup-compatibility/2006" xmlns:mo="http://schemas.microsoft.com/office/mac/office/2008/main" xmlns:mv="urn:schemas-microsoft-com:mac:vml" xmlns:o="urn:schemas-microsoft-com:office:office" xmlns:r="http://schemas.openxmlformats.org/officeDocument/2006/relationships" xmlns:v="urn:schemas-microsoft-com:vml" xmlns:w10="urn:schemas-microsoft-com:office:word" xmlns:w14="http://schemas.microsoft.com/office/word/2010/wordml" xmlns:w="http://schemas.openxmlformats.org/wordprocessingml/2006/main" xmlns:wne="http://schemas.microsoft.com/office/word/2006/wordml" xmlns:wp14="http://schemas.microsoft.com/office/word/2010/wordprocessingDrawing" xmlns:wp="http://schemas.openxmlformats.org/drawingml/2006/wordprocessingDrawing" xmlns:wpc="http://schemas.microsoft.com/office/word/2010/wordprocessingCanvas" xmlns:wpg="http://schemas.microsoft.com/office/word/2010/wordprocessingGroup" xmlns:wpi="http://schemas.microsoft.com/office/word/2010/wordprocessingInk" xmlns:wps="http://schemas.microsoft.com/office/word/2010/wordprocessingShape" mc:Ignorable="w14 wp14">
+  <w:tbl>
+    <w:tblPr>
+      <w:tblW w:type="auto" w:w="0"/>
+      <w:tblLook w:firstColumn="1" w:firstRow="1" w:lastColumn="0" w:lastRow="0" w:noHBand="0" w:noVBand="1" w:val="04A0"/>
+      <w:tblBorders>
+        <w:top w:val="none" w:sz="0" w:space="0" w:color="auto"/>
+        <w:left w:val="none" w:sz="0" w:space="0" w:color="auto"/>
+        <w:bottom w:val="none" w:sz="0" w:space="0" w:color="auto"/>
+        <w:right w:val="none" w:sz="0" w:space="0" w:color="auto"/>
+        <w:insideH w:val="none" w:sz="0" w:space="0" w:color="auto"/>
+        <w:insideV w:val="none" w:sz="0" w:space="0" w:color="auto"/>
+      </w:tblBorders>
+      <w:tblW w:w="5000" w:type="pct"/>
+    </w:tblPr>
+    <w:tblGrid>
+      <w:gridCol w:w="11906"/>
+    </w:tblGrid>
+    <w:tr>
+      <w:trPr>
+        <w:trHeight w:val="1500" w:hRule="atLeast"/>
+      </w:trPr>
+      <w:tc>
+        <w:tcPr>
+          <w:tcW w:type="dxa" w:w="11906"/>
+          <w:shd w:val="clear" w:color="auto" w:fill="1E1E1E"/>
+          <w:tcMar>
+            <w:top w:w="300" w:type="dxa"/>
+            <w:left w:w="500" w:type="dxa"/>
+            <w:bottom w:w="220" w:type="dxa"/>
+            <w:right w:w="500" w:type="dxa"/>
+          </w:tcMar>
+        </w:tcPr>
+        <w:p>
+          <w:pPr>
+            <w:spacing w:before="120" w:after="80"/>
+            <w:jc w:val="center"/>
+          </w:pPr>
+          <w:r>
+            <w:drawing>
+              <wp:inline xmlns:a="http://schemas.openxmlformats.org/drawingml/2006/main" xmlns:pic="http://schemas.openxmlformats.org/drawingml/2006/picture">
+                <wp:extent cx="1152000" cy="1152000"/>
+                <wp:docPr id="1" name="Picture 1"/>
+                <wp:cNvGraphicFramePr>
+                  <a:graphicFrameLocks noChangeAspect="1"/>
+                </wp:cNvGraphicFramePr>
+                <a:graphic>
+                  <a:graphicData uri="http://schemas.openxmlformats.org/drawingml/2006/picture">
+                    <pic:pic>
+                      <pic:nvPicPr>
+                        <pic:cNvPr id="0" name="jcpv_logo.png"/>
+                        <pic:cNvPicPr/>
+                      </pic:nvPicPr>
+                      <pic:blipFill>
+                        <a:blip r:embed="rId1"/>
+                        <a:stretch>
+                          <a:fillRect/>
+                        </a:stretch>
+                      </pic:blipFill>
+                      <pic:spPr>
+                        <a:xfrm>
+                          <a:off x="0" y="0"/>
+                          <a:ext cx="1152000" cy="1152000"/>
+                        </a:xfrm>
+                        <a:prstGeom prst="rect"/>
+                      </pic:spPr>
+                    </pic:pic>
+                  </a:graphicData>
+                </a:graphic>
+              </wp:inline>
+            </w:drawing>
+          </w:r>
+        </w:p>
+        <w:p>
+          <w:pPr>
+            <w:spacing w:before="40" w:after="0"/>
+            <w:jc w:val="center"/>
+          </w:pPr>
+          <w:r>
+            <w:rPr>
+              <w:rFonts w:ascii="Garamond" w:hAnsi="Garamond"/>
+              <w:b w:val="0"/>
+              <w:i/>
+              <w:color w:val="CCBB99"/>
+              <w:sz w:val="16"/>
+              <w:u w:val="none"/>
+            </w:rPr>
+            <w:t>A defesa técnica do seu patrimônio.</w:t>
+          </w:r>
+        </w:p>
+        <w:p>
+          <w:pPr>
+            <w:spacing w:before="120" w:after="0"/>
+            <w:pBdr>
+              <w:bottom w:val="single" w:sz="8" w:space="1" w:color="B89B6A"/>
+            </w:pBdr>
+          </w:pPr>
+        </w:p>
+        <w:p>
+          <w:pPr>
+            <w:spacing w:before="80" w:after="80"/>
+            <w:jc w:val="center"/>
+          </w:pPr>
+          <w:r>
+            <w:rPr>
+              <w:rFonts w:ascii="Garamond" w:hAnsi="Garamond"/>
+              <w:b w:val="0"/>
+              <w:i w:val="0"/>
+              <w:color w:val="B89B6A"/>
+              <w:sz w:val="15"/>
+              <w:u w:val="none"/>
+            </w:rPr>
+            <w:t>OAB/PR 118.596   ·   Alta Performance Jurídica   ·   Sigilo Absoluto   ·   Atuação Nacional</w:t>
+          </w:r>
+        </w:p>
+      </w:tc>
+    </w:tr>
+  </w:tbl>
+</w:hdr>
 </file>
 
 <file path=word/numbering.xml><?xml version="1.0" encoding="utf-8"?>
@@ -1031,6 +1124,10 @@
     <w:pPr>
       <w:spacing w:before="0" w:after="0"/>
     </w:pPr>
+    <w:rPr>
+      <w:rFonts w:ascii="Times New Roman" w:hAnsi="Times New Roman"/>
+      <w:sz w:val="24"/>
+    </w:rPr>
   </w:style>
   <w:style w:type="paragraph" w:styleId="Header">
     <w:name w:val="header"/>

</xml_diff>